<commit_message>
barlow: correct label-set facts — Ch. 6 uses 1,274 tiles (616 locations), not just the 217
217 = Ch. 4 / 2022 Taylor Valley proof of concept. Ch. 6 multi-valley set =
601 tiles (2014 NCALM) + 528 (2001 NASA) + 145 (2014 REMA). Verified against
dissertation pp. 112-115. Reference doc + manifest updated; Ch. 6 set is the
one to request from the author.

Co-Authored-By: Claude Fable 5 <noreply@anthropic.com>
</commit_message>
<xml_diff>
--- a/barlow/docs/finesst_reference.docx
+++ b/barlow/docs/finesst_reference.docx
@@ -836,7 +836,7 @@
                 <w:i w:val="0"/>
                 <w:sz w:val="18"/>
               </w:rPr>
-              <w:t>Hand-labeled 300 × 300 m training tiles (~1% of study area)</w:t>
+              <w:t>Hand-labeled 300 × 300 m tiles in the original Taylor Valley proof of concept (~1% of the valley)</w:t>
             </w:r>
           </w:p>
         </w:tc>
@@ -856,7 +856,69 @@
                 <w:i w:val="0"/>
                 <w:sz w:val="18"/>
               </w:rPr>
-              <w:t>Barlow Ch. 4</w:t>
+              <w:t>Barlow Ch. 4 / 2022 paper</w:t>
+            </w:r>
+          </w:p>
+        </w:tc>
+      </w:tr>
+      <w:tr>
+        <w:tc>
+          <w:tcPr>
+            <w:tcW w:type="dxa" w:w="3216"/>
+          </w:tcPr>
+          <w:p>
+            <w:pPr>
+              <w:spacing w:after="20"/>
+            </w:pPr>
+            <w:r/>
+            <w:r>
+              <w:rPr>
+                <w:rFonts w:ascii="Calibri" w:hAnsi="Calibri"/>
+                <w:b/>
+                <w:i w:val="0"/>
+                <w:sz w:val="18"/>
+              </w:rPr>
+              <w:t>1,274</w:t>
+            </w:r>
+          </w:p>
+        </w:tc>
+        <w:tc>
+          <w:tcPr>
+            <w:tcW w:type="dxa" w:w="3216"/>
+          </w:tcPr>
+          <w:p>
+            <w:pPr>
+              <w:spacing w:after="20"/>
+            </w:pPr>
+            <w:r/>
+            <w:r>
+              <w:rPr>
+                <w:rFonts w:ascii="Calibri" w:hAnsi="Calibri"/>
+                <w:b w:val="0"/>
+                <w:i w:val="0"/>
+                <w:sz w:val="18"/>
+              </w:rPr>
+              <w:t>Training tiles in the scaled-up multi-valley model: 601 from 2014 lidar + 528 from 2001 lidar + 145 from REMA, drawn at 616 unique locations</w:t>
+            </w:r>
+          </w:p>
+        </w:tc>
+        <w:tc>
+          <w:tcPr>
+            <w:tcW w:type="dxa" w:w="3216"/>
+          </w:tcPr>
+          <w:p>
+            <w:pPr>
+              <w:spacing w:after="20"/>
+            </w:pPr>
+            <w:r/>
+            <w:r>
+              <w:rPr>
+                <w:rFonts w:ascii="Calibri" w:hAnsi="Calibri"/>
+                <w:b w:val="0"/>
+                <w:i w:val="0"/>
+                <w:sz w:val="18"/>
+              </w:rPr>
+              <w:t>Barlow Ch. 6</w:t>
             </w:r>
           </w:p>
         </w:tc>
@@ -2466,31 +2528,23 @@
     </w:p>
     <w:p>
       <w:pPr>
-        <w:spacing w:after="160"/>
-        <w:jc w:val="center"/>
+        <w:spacing w:after="120"/>
       </w:pPr>
       <w:r>
         <w:rPr>
           <w:rFonts w:ascii="Calibri" w:hAnsi="Calibri"/>
           <w:b/>
-          <w:i/>
-          <w:color w:val="666666"/>
-          <w:sz w:val="18"/>
+          <w:i w:val="0"/>
         </w:rPr>
-        <w:t>What if you can't get her 217 training labels?</w:t>
+        <w:t>What if you can't get her training labels?</w:t>
       </w:r>
-    </w:p>
-    <w:p>
-      <w:pPr>
-        <w:spacing w:after="120"/>
-      </w:pPr>
       <w:r>
         <w:rPr>
           <w:rFonts w:ascii="Calibri" w:hAnsi="Calibri"/>
           <w:b w:val="0"/>
           <w:i w:val="0"/>
         </w:rPr>
-        <w:t>Two exits: the public LTER stream centerlines already work as a stand-in (current figures use them), and worst case I re-digitize a comparable set — hand-labeling terrain features is what I do in my other project.</w:t>
+        <w:t xml:space="preserve"> (217 tiles in the 2022 paper; the full Ch. 6 set is 1,274 tiles at 616 locations — that's the real ask.) Two exits: the public LTER stream centerlines already work as a stand-in (current figures use them), and worst case I re-digitize a comparable set — hand-labeling terrain features is what I do in my other project.</w:t>
       </w:r>
     </w:p>
     <w:p>
@@ -3545,7 +3599,7 @@
                 <w:i w:val="0"/>
                 <w:sz w:val="18"/>
               </w:rPr>
-              <w:t>Barlow's 217 label tiles are author-gated</w:t>
+              <w:t>Barlow's label tiles are author-gated (217 in Ch. 4; 1,274 in Ch. 6)</w:t>
             </w:r>
           </w:p>
         </w:tc>

</xml_diff>

<commit_message>
barlow: re-run rates inside Cami's detected channel masks — signal invariant (r=+0.95)
Cami shared her working GIS data (barlow/Shapefiles/, gitignored: author-private),
incl. final U-Net-detected channel polygons per epoch (Streams_Final_052026).
- _change_detection.py: --channels {lter,cami}; per-stream mask = LTER corridor
  intersect union of the two epochs' Cami polygons; cami_pct column; window totals.
- Attribution pilot unchanged inside her masks: lidar epoch r=+0.95 (p=0.003),
  rho=+0.94; leave-one-out worst improves +0.82 -> +0.87. REMA epoch stays null.
- _fetch_barlow_data.py: LTER driver expansion (met network 7002-7030, melt-model
  8000-series, ground ice 501+SLIME, lake level 68/67/3104).
- Manifest: author-provided data inventory + LINZ = the "NZ resource"; analysis_log
  entry; reference doc updated (+docx re-render).

Co-Authored-By: Claude Fable 5 <noreply@anthropic.com>
</commit_message>
<xml_diff>
--- a/barlow/docs/finesst_reference.docx
+++ b/barlow/docs/finesst_reference.docx
@@ -2235,6 +2235,84 @@
           </w:p>
         </w:tc>
       </w:tr>
+      <w:tr>
+        <w:tc>
+          <w:tcPr>
+            <w:tcW w:type="dxa" w:w="4824"/>
+          </w:tcPr>
+          <w:p>
+            <w:pPr>
+              <w:spacing w:after="20"/>
+            </w:pPr>
+            <w:r/>
+            <w:r>
+              <w:rPr>
+                <w:rFonts w:ascii="Calibri" w:hAnsi="Calibri"/>
+                <w:b w:val="0"/>
+                <w:i w:val="0"/>
+                <w:sz w:val="18"/>
+              </w:rPr>
+              <w:t>The signal doesn't depend on my channel choice</w:t>
+            </w:r>
+          </w:p>
+        </w:tc>
+        <w:tc>
+          <w:tcPr>
+            <w:tcW w:type="dxa" w:w="4824"/>
+          </w:tcPr>
+          <w:p>
+            <w:pPr>
+              <w:spacing w:after="20"/>
+            </w:pPr>
+            <w:r/>
+            <w:r>
+              <w:rPr>
+                <w:rFonts w:ascii="Calibri" w:hAnsi="Calibri"/>
+                <w:b w:val="0"/>
+                <w:i w:val="0"/>
+                <w:sz w:val="18"/>
+              </w:rPr>
+              <w:t xml:space="preserve">Re-ran rates inside </w:t>
+            </w:r>
+            <w:r>
+              <w:rPr>
+                <w:rFonts w:ascii="Calibri" w:hAnsi="Calibri"/>
+                <w:b/>
+                <w:i w:val="0"/>
+                <w:sz w:val="18"/>
+              </w:rPr>
+              <w:t>Cami's own detected channel outlines</w:t>
+            </w:r>
+            <w:r>
+              <w:rPr>
+                <w:rFonts w:ascii="Calibri" w:hAnsi="Calibri"/>
+                <w:b w:val="0"/>
+                <w:i w:val="0"/>
+                <w:sz w:val="18"/>
+              </w:rPr>
+              <w:t xml:space="preserve"> (author-provided, May 2026): r = +0.95 either way; leave-one-out worst case </w:t>
+            </w:r>
+            <w:r>
+              <w:rPr>
+                <w:rFonts w:ascii="Calibri" w:hAnsi="Calibri"/>
+                <w:b w:val="0"/>
+                <w:i/>
+                <w:sz w:val="18"/>
+              </w:rPr>
+              <w:t>improves</w:t>
+            </w:r>
+            <w:r>
+              <w:rPr>
+                <w:rFonts w:ascii="Calibri" w:hAnsi="Calibri"/>
+                <w:b w:val="0"/>
+                <w:i w:val="0"/>
+                <w:sz w:val="18"/>
+              </w:rPr>
+              <w:t xml:space="preserve"> (+0.82 → +0.87)</w:t>
+            </w:r>
+          </w:p>
+        </w:tc>
+      </w:tr>
     </w:tbl>
     <w:p>
       <w:pPr>
@@ -2544,7 +2622,23 @@
           <w:b w:val="0"/>
           <w:i w:val="0"/>
         </w:rPr>
-        <w:t xml:space="preserve"> (217 tiles in the 2022 paper; the full Ch. 6 set is 1,274 tiles at 616 locations — that's the real ask.) Two exits: the public LTER stream centerlines already work as a stand-in (current figures use them), and worst case I re-digitize a comparable set — hand-labeling terrain features is what I do in my other project.</w:t>
+        <w:t xml:space="preserve"> (217 tiles in the 2022 paper; the full Ch. 6 set is 1,274 tiles at 616 locations — that's the real ask.) Two exits: the public LTER stream centerlines already work as a stand-in (current figures use them), and worst case I re-digitize a comparable set — hand-labeling terrain features is what I do in my other project. Update: she has already shared her final </w:t>
+      </w:r>
+      <w:r>
+        <w:rPr>
+          <w:rFonts w:ascii="Calibri" w:hAnsi="Calibri"/>
+          <w:b w:val="0"/>
+          <w:i/>
+        </w:rPr>
+        <w:t>detected</w:t>
+      </w:r>
+      <w:r>
+        <w:rPr>
+          <w:rFonts w:ascii="Calibri" w:hAnsi="Calibri"/>
+          <w:b w:val="0"/>
+          <w:i w:val="0"/>
+        </w:rPr>
+        <w:t xml:space="preserve"> channel outlines (May 2026) — I've verified my rates inside her exact masks; only the training tiles remain author-gated.</w:t>
       </w:r>
     </w:p>
     <w:p>

</xml_diff>